<commit_message>
Finish TSW7 and Tadami Line
</commit_message>
<xml_diff>
--- a/raildriver-Other-Remapped.docx
+++ b/raildriver-Other-Remapped.docx
@@ -13179,6 +13179,1202 @@
                 <w:szCs w:val="16"/>
               </w:rPr>
               <w:t>Parking Brake Off</w:t>
+            </w:r>
+          </w:p>
+        </w:tc>
+        <w:tc>
+          <w:tcPr>
+            <w:tcW w:w="1016" w:type="dxa"/>
+            <w:tcBorders>
+              <w:top w:val="single" w:sz="4" w:space="0" w:color="000000"/>
+              <w:left w:val="single" w:sz="4" w:space="0" w:color="000000"/>
+              <w:bottom w:val="single" w:sz="4" w:space="0" w:color="000000"/>
+            </w:tcBorders>
+            <w:vAlign w:val="bottom"/>
+          </w:tcPr>
+          <w:p>
+            <w:pPr>
+              <w:pStyle w:val="Normal"/>
+              <w:widowControl w:val="false"/>
+              <w:spacing w:lineRule="auto" w:line="180"/>
+              <w:jc w:val="center"/>
+              <w:rPr>
+                <w:color w:val="000000"/>
+                <w:sz w:val="16"/>
+                <w:szCs w:val="16"/>
+              </w:rPr>
+            </w:pPr>
+            <w:r>
+              <w:rPr>
+                <w:rFonts w:eastAsia="arial" w:ascii="arial" w:hAnsi="arial"/>
+                <w:color w:val="000000"/>
+                <w:sz w:val="16"/>
+                <w:szCs w:val="16"/>
+              </w:rPr>
+              <w:t>Exterior</w:t>
+            </w:r>
+          </w:p>
+          <w:p>
+            <w:pPr>
+              <w:pStyle w:val="Normal"/>
+              <w:widowControl w:val="false"/>
+              <w:spacing w:lineRule="auto" w:line="180"/>
+              <w:jc w:val="center"/>
+              <w:rPr>
+                <w:color w:val="000000"/>
+                <w:sz w:val="16"/>
+                <w:szCs w:val="16"/>
+              </w:rPr>
+            </w:pPr>
+            <w:r>
+              <w:rPr>
+                <w:rFonts w:eastAsia="arial" w:ascii="arial" w:hAnsi="arial"/>
+                <w:color w:val="000000"/>
+                <w:sz w:val="16"/>
+                <w:szCs w:val="16"/>
+              </w:rPr>
+              <w:t>Camera</w:t>
+            </w:r>
+          </w:p>
+        </w:tc>
+        <w:tc>
+          <w:tcPr>
+            <w:tcW w:w="1029" w:type="dxa"/>
+            <w:tcBorders>
+              <w:top w:val="single" w:sz="4" w:space="0" w:color="000000"/>
+              <w:left w:val="single" w:sz="4" w:space="0" w:color="000000"/>
+              <w:bottom w:val="single" w:sz="4" w:space="0" w:color="000000"/>
+              <w:right w:val="single" w:sz="4" w:space="0" w:color="000000"/>
+            </w:tcBorders>
+            <w:vAlign w:val="bottom"/>
+          </w:tcPr>
+          <w:p>
+            <w:pPr>
+              <w:pStyle w:val="Normal"/>
+              <w:widowControl w:val="false"/>
+              <w:spacing w:lineRule="auto" w:line="180"/>
+              <w:jc w:val="center"/>
+              <w:rPr>
+                <w:color w:val="000000"/>
+                <w:sz w:val="16"/>
+                <w:szCs w:val="16"/>
+              </w:rPr>
+            </w:pPr>
+            <w:r>
+              <w:rPr>
+                <w:rFonts w:eastAsia="arial" w:ascii="arial" w:hAnsi="arial"/>
+                <w:color w:val="000000"/>
+                <w:sz w:val="16"/>
+                <w:szCs w:val="16"/>
+              </w:rPr>
+              <w:t>Prev</w:t>
+            </w:r>
+          </w:p>
+          <w:p>
+            <w:pPr>
+              <w:pStyle w:val="Normal"/>
+              <w:widowControl w:val="false"/>
+              <w:spacing w:lineRule="auto" w:line="180"/>
+              <w:jc w:val="center"/>
+              <w:rPr>
+                <w:color w:val="000000"/>
+                <w:sz w:val="16"/>
+                <w:szCs w:val="16"/>
+              </w:rPr>
+            </w:pPr>
+            <w:r>
+              <w:rPr>
+                <w:rFonts w:eastAsia="arial" w:ascii="arial" w:hAnsi="arial"/>
+                <w:color w:val="000000"/>
+                <w:sz w:val="16"/>
+                <w:szCs w:val="16"/>
+              </w:rPr>
+              <w:t>Cab Cam</w:t>
+            </w:r>
+          </w:p>
+        </w:tc>
+      </w:tr>
+    </w:tbl>
+    <w:p>
+      <w:pPr>
+        <w:pStyle w:val="Normal"/>
+        <w:bidi w:val="0"/>
+        <w:rPr>
+          <w:color w:val="000000"/>
+          <w:sz w:val="16"/>
+          <w:szCs w:val="16"/>
+        </w:rPr>
+      </w:pPr>
+      <w:r>
+        <w:rPr>
+          <w:color w:val="000000"/>
+          <w:sz w:val="16"/>
+          <w:szCs w:val="16"/>
+        </w:rPr>
+      </w:r>
+    </w:p>
+    <w:p>
+      <w:pPr>
+        <w:pStyle w:val="Normal"/>
+        <w:rPr>
+          <w:color w:val="000000"/>
+          <w:sz w:val="16"/>
+          <w:szCs w:val="16"/>
+        </w:rPr>
+      </w:pPr>
+      <w:r>
+        <w:rPr>
+          <w:color w:val="000000"/>
+          <w:sz w:val="16"/>
+          <w:szCs w:val="16"/>
+        </w:rPr>
+        <w:tab/>
+        <w:t xml:space="preserve">       </w:t>
+      </w:r>
+      <w:r>
+        <w:rPr>
+          <w:rFonts w:eastAsia="arial" w:ascii="arial" w:hAnsi="arial"/>
+          <w:color w:val="000000"/>
+          <w:sz w:val="16"/>
+          <w:szCs w:val="16"/>
+        </w:rPr>
+        <w:t xml:space="preserve">    </w:t>
+      </w:r>
+      <w:r>
+        <w:rPr>
+          <w:rFonts w:eastAsia="arial" w:ascii="arial" w:hAnsi="arial"/>
+          <w:color w:val="000000"/>
+          <w:sz w:val="16"/>
+          <w:szCs w:val="16"/>
+        </w:rPr>
+        <w:t>Kiha40-500</w:t>
+      </w:r>
+      <w:r>
+        <w:rPr>
+          <w:rFonts w:eastAsia="arial" w:ascii="arial" w:hAnsi="arial"/>
+          <w:color w:val="000000"/>
+          <w:sz w:val="16"/>
+          <w:szCs w:val="16"/>
+        </w:rPr>
+        <w:t>-1</w:t>
+      </w:r>
+    </w:p>
+    <w:tbl>
+      <w:tblPr>
+        <w:tblW w:w="14248" w:type="dxa"/>
+        <w:jc w:val="left"/>
+        <w:tblInd w:w="-5" w:type="dxa"/>
+        <w:tblLayout w:type="fixed"/>
+        <w:tblCellMar>
+          <w:top w:w="0" w:type="dxa"/>
+          <w:left w:w="108" w:type="dxa"/>
+          <w:bottom w:w="0" w:type="dxa"/>
+          <w:right w:w="108" w:type="dxa"/>
+        </w:tblCellMar>
+        <w:tblLook w:firstRow="1" w:noVBand="1" w:lastRow="0" w:firstColumn="1" w:lastColumn="0" w:noHBand="0" w:val="04a0"/>
+      </w:tblPr>
+      <w:tblGrid>
+        <w:gridCol w:w="1017"/>
+        <w:gridCol w:w="1019"/>
+        <w:gridCol w:w="1014"/>
+        <w:gridCol w:w="1016"/>
+        <w:gridCol w:w="1020"/>
+        <w:gridCol w:w="1016"/>
+        <w:gridCol w:w="1016"/>
+        <w:gridCol w:w="1017"/>
+        <w:gridCol w:w="1016"/>
+        <w:gridCol w:w="1020"/>
+        <w:gridCol w:w="1016"/>
+        <w:gridCol w:w="1016"/>
+        <w:gridCol w:w="1016"/>
+        <w:gridCol w:w="1029"/>
+      </w:tblGrid>
+      <w:tr>
+        <w:trPr>
+          <w:trHeight w:val="440" w:hRule="exact"/>
+          <w:cantSplit w:val="true"/>
+        </w:trPr>
+        <w:tc>
+          <w:tcPr>
+            <w:tcW w:w="1017" w:type="dxa"/>
+            <w:tcBorders>
+              <w:top w:val="single" w:sz="4" w:space="0" w:color="000000"/>
+              <w:left w:val="single" w:sz="4" w:space="0" w:color="000000"/>
+              <w:bottom w:val="single" w:sz="4" w:space="0" w:color="000000"/>
+            </w:tcBorders>
+            <w:vAlign w:val="bottom"/>
+          </w:tcPr>
+          <w:p>
+            <w:pPr>
+              <w:pStyle w:val="Normal"/>
+              <w:widowControl w:val="false"/>
+              <w:spacing w:lineRule="auto" w:line="180" w:before="0" w:after="60"/>
+              <w:jc w:val="center"/>
+              <w:rPr>
+                <w:color w:val="000000"/>
+                <w:sz w:val="16"/>
+                <w:szCs w:val="16"/>
+              </w:rPr>
+            </w:pPr>
+            <w:r>
+              <w:rPr>
+                <w:rFonts w:eastAsia="arial" w:ascii="arial" w:hAnsi="arial"/>
+                <w:b/>
+                <w:color w:val="000000"/>
+                <w:sz w:val="16"/>
+                <w:szCs w:val="16"/>
+              </w:rPr>
+              <w:t>Pause</w:t>
+            </w:r>
+          </w:p>
+        </w:tc>
+        <w:tc>
+          <w:tcPr>
+            <w:tcW w:w="1019" w:type="dxa"/>
+            <w:tcBorders>
+              <w:top w:val="single" w:sz="4" w:space="0" w:color="000000"/>
+              <w:left w:val="single" w:sz="4" w:space="0" w:color="000000"/>
+              <w:bottom w:val="single" w:sz="4" w:space="0" w:color="000000"/>
+            </w:tcBorders>
+            <w:vAlign w:val="bottom"/>
+          </w:tcPr>
+          <w:p>
+            <w:pPr>
+              <w:pStyle w:val="Normal"/>
+              <w:widowControl w:val="false"/>
+              <w:spacing w:lineRule="auto" w:line="180"/>
+              <w:jc w:val="center"/>
+              <w:rPr>
+                <w:color w:val="000000"/>
+                <w:sz w:val="16"/>
+                <w:szCs w:val="16"/>
+              </w:rPr>
+            </w:pPr>
+            <w:r>
+              <w:rPr>
+                <w:color w:val="000000"/>
+                <w:sz w:val="16"/>
+                <w:szCs w:val="16"/>
+              </w:rPr>
+              <w:t xml:space="preserve">Master </w:t>
+            </w:r>
+            <w:r>
+              <w:rPr>
+                <w:color w:val="000000"/>
+                <w:sz w:val="16"/>
+                <w:szCs w:val="16"/>
+              </w:rPr>
+              <w:t>Handle</w:t>
+            </w:r>
+          </w:p>
+        </w:tc>
+        <w:tc>
+          <w:tcPr>
+            <w:tcW w:w="1014" w:type="dxa"/>
+            <w:tcBorders>
+              <w:top w:val="single" w:sz="4" w:space="0" w:color="000000"/>
+              <w:left w:val="single" w:sz="4" w:space="0" w:color="000000"/>
+              <w:bottom w:val="single" w:sz="4" w:space="0" w:color="000000"/>
+            </w:tcBorders>
+            <w:vAlign w:val="bottom"/>
+          </w:tcPr>
+          <w:p>
+            <w:pPr>
+              <w:pStyle w:val="Normal"/>
+              <w:widowControl w:val="false"/>
+              <w:spacing w:lineRule="auto" w:line="180"/>
+              <w:jc w:val="center"/>
+              <w:rPr>
+                <w:sz w:val="16"/>
+                <w:szCs w:val="16"/>
+              </w:rPr>
+            </w:pPr>
+            <w:r>
+              <w:rPr>
+                <w:sz w:val="16"/>
+                <w:szCs w:val="16"/>
+              </w:rPr>
+              <w:t>Engine Start</w:t>
+            </w:r>
+          </w:p>
+        </w:tc>
+        <w:tc>
+          <w:tcPr>
+            <w:tcW w:w="1016" w:type="dxa"/>
+            <w:tcBorders>
+              <w:top w:val="single" w:sz="4" w:space="0" w:color="000000"/>
+              <w:left w:val="single" w:sz="4" w:space="0" w:color="000000"/>
+              <w:bottom w:val="single" w:sz="4" w:space="0" w:color="000000"/>
+            </w:tcBorders>
+            <w:vAlign w:val="bottom"/>
+          </w:tcPr>
+          <w:p>
+            <w:pPr>
+              <w:pStyle w:val="Normal"/>
+              <w:widowControl w:val="false"/>
+              <w:spacing w:lineRule="auto" w:line="180"/>
+              <w:jc w:val="center"/>
+              <w:rPr>
+                <w:sz w:val="16"/>
+                <w:szCs w:val="16"/>
+              </w:rPr>
+            </w:pPr>
+            <w:r>
+              <w:rPr>
+                <w:rFonts w:eastAsia="arial" w:ascii="arial" w:hAnsi="arial"/>
+                <w:color w:val="000000"/>
+                <w:sz w:val="16"/>
+                <w:szCs w:val="16"/>
+              </w:rPr>
+              <w:t>ATS/EB Power</w:t>
+            </w:r>
+          </w:p>
+        </w:tc>
+        <w:tc>
+          <w:tcPr>
+            <w:tcW w:w="1020" w:type="dxa"/>
+            <w:tcBorders>
+              <w:top w:val="single" w:sz="4" w:space="0" w:color="000000"/>
+              <w:left w:val="single" w:sz="4" w:space="0" w:color="000000"/>
+              <w:bottom w:val="single" w:sz="4" w:space="0" w:color="000000"/>
+            </w:tcBorders>
+            <w:vAlign w:val="bottom"/>
+          </w:tcPr>
+          <w:p>
+            <w:pPr>
+              <w:pStyle w:val="Normal"/>
+              <w:widowControl w:val="false"/>
+              <w:spacing w:lineRule="auto" w:line="180"/>
+              <w:jc w:val="center"/>
+              <w:rPr>
+                <w:color w:val="000000"/>
+                <w:sz w:val="16"/>
+                <w:szCs w:val="16"/>
+              </w:rPr>
+            </w:pPr>
+            <w:r>
+              <w:rPr>
+                <w:rFonts w:eastAsia="arial" w:ascii="arial" w:hAnsi="arial"/>
+                <w:color w:val="000000"/>
+                <w:sz w:val="16"/>
+                <w:szCs w:val="16"/>
+              </w:rPr>
+              <w:t>Engine Handle</w:t>
+            </w:r>
+          </w:p>
+        </w:tc>
+        <w:tc>
+          <w:tcPr>
+            <w:tcW w:w="1016" w:type="dxa"/>
+            <w:tcBorders>
+              <w:top w:val="single" w:sz="4" w:space="0" w:color="000000"/>
+              <w:left w:val="single" w:sz="4" w:space="0" w:color="000000"/>
+              <w:bottom w:val="single" w:sz="4" w:space="0" w:color="000000"/>
+            </w:tcBorders>
+            <w:vAlign w:val="bottom"/>
+          </w:tcPr>
+          <w:p>
+            <w:pPr>
+              <w:pStyle w:val="Normal"/>
+              <w:widowControl w:val="false"/>
+              <w:jc w:val="center"/>
+              <w:rPr>
+                <w:color w:val="000000"/>
+                <w:sz w:val="16"/>
+                <w:szCs w:val="16"/>
+              </w:rPr>
+            </w:pPr>
+            <w:r>
+              <w:rPr>
+                <w:color w:val="000000"/>
+                <w:sz w:val="16"/>
+                <w:szCs w:val="16"/>
+              </w:rPr>
+              <w:t>Trans. Direct</w:t>
+            </w:r>
+          </w:p>
+        </w:tc>
+        <w:tc>
+          <w:tcPr>
+            <w:tcW w:w="1016" w:type="dxa"/>
+            <w:tcBorders>
+              <w:top w:val="single" w:sz="4" w:space="0" w:color="000000"/>
+              <w:left w:val="single" w:sz="4" w:space="0" w:color="000000"/>
+              <w:bottom w:val="single" w:sz="4" w:space="0" w:color="000000"/>
+            </w:tcBorders>
+            <w:vAlign w:val="bottom"/>
+          </w:tcPr>
+          <w:p>
+            <w:pPr>
+              <w:pStyle w:val="Normal"/>
+              <w:widowControl w:val="false"/>
+              <w:jc w:val="center"/>
+              <w:rPr>
+                <w:color w:val="000000"/>
+                <w:sz w:val="16"/>
+                <w:szCs w:val="16"/>
+              </w:rPr>
+            </w:pPr>
+            <w:r>
+              <w:rPr>
+                <w:color w:val="000000"/>
+                <w:sz w:val="16"/>
+                <w:szCs w:val="16"/>
+              </w:rPr>
+              <w:t>Engine Stop</w:t>
+            </w:r>
+          </w:p>
+        </w:tc>
+        <w:tc>
+          <w:tcPr>
+            <w:tcW w:w="1017" w:type="dxa"/>
+            <w:tcBorders>
+              <w:top w:val="single" w:sz="4" w:space="0" w:color="000000"/>
+              <w:left w:val="single" w:sz="4" w:space="0" w:color="000000"/>
+              <w:bottom w:val="single" w:sz="4" w:space="0" w:color="000000"/>
+            </w:tcBorders>
+            <w:vAlign w:val="bottom"/>
+          </w:tcPr>
+          <w:p>
+            <w:pPr>
+              <w:pStyle w:val="Normal"/>
+              <w:widowControl w:val="false"/>
+              <w:jc w:val="center"/>
+              <w:rPr>
+                <w:color w:val="000000"/>
+                <w:sz w:val="16"/>
+                <w:szCs w:val="16"/>
+              </w:rPr>
+            </w:pPr>
+            <w:r>
+              <w:rPr>
+                <w:rFonts w:eastAsia="arial" w:ascii="arial" w:hAnsi="arial"/>
+                <w:color w:val="000000"/>
+                <w:sz w:val="16"/>
+                <w:szCs w:val="16"/>
+              </w:rPr>
+              <w:t>Cab Activate</w:t>
+            </w:r>
+          </w:p>
+        </w:tc>
+        <w:tc>
+          <w:tcPr>
+            <w:tcW w:w="1016" w:type="dxa"/>
+            <w:tcBorders>
+              <w:top w:val="single" w:sz="4" w:space="0" w:color="000000"/>
+              <w:left w:val="single" w:sz="4" w:space="0" w:color="000000"/>
+              <w:bottom w:val="single" w:sz="4" w:space="0" w:color="000000"/>
+            </w:tcBorders>
+            <w:vAlign w:val="bottom"/>
+          </w:tcPr>
+          <w:p>
+            <w:pPr>
+              <w:pStyle w:val="Normal"/>
+              <w:widowControl w:val="false"/>
+              <w:bidi w:val="0"/>
+              <w:spacing w:lineRule="auto" w:line="180"/>
+              <w:jc w:val="center"/>
+              <w:rPr>
+                <w:color w:val="000000"/>
+                <w:sz w:val="16"/>
+                <w:szCs w:val="16"/>
+              </w:rPr>
+            </w:pPr>
+            <w:r>
+              <w:rPr>
+                <w:rFonts w:eastAsia="arial" w:ascii="arial" w:hAnsi="arial"/>
+                <w:color w:val="000000"/>
+                <w:sz w:val="16"/>
+                <w:szCs w:val="16"/>
+              </w:rPr>
+              <w:t>Dest. Board Up</w:t>
+            </w:r>
+          </w:p>
+        </w:tc>
+        <w:tc>
+          <w:tcPr>
+            <w:tcW w:w="1020" w:type="dxa"/>
+            <w:tcBorders>
+              <w:top w:val="single" w:sz="4" w:space="0" w:color="000000"/>
+              <w:left w:val="single" w:sz="4" w:space="0" w:color="000000"/>
+              <w:bottom w:val="single" w:sz="4" w:space="0" w:color="000000"/>
+            </w:tcBorders>
+            <w:vAlign w:val="bottom"/>
+          </w:tcPr>
+          <w:p>
+            <w:pPr>
+              <w:pStyle w:val="Normal"/>
+              <w:widowControl w:val="false"/>
+              <w:jc w:val="center"/>
+              <w:rPr>
+                <w:color w:val="000000"/>
+                <w:sz w:val="16"/>
+                <w:szCs w:val="16"/>
+              </w:rPr>
+            </w:pPr>
+            <w:r>
+              <w:rPr>
+                <w:rFonts w:eastAsia="arial" w:ascii="arial" w:hAnsi="arial"/>
+                <w:color w:val="000000"/>
+                <w:sz w:val="16"/>
+                <w:szCs w:val="16"/>
+              </w:rPr>
+              <w:t>Headlight</w:t>
+            </w:r>
+          </w:p>
+          <w:p>
+            <w:pPr>
+              <w:pStyle w:val="Normal"/>
+              <w:widowControl w:val="false"/>
+              <w:jc w:val="center"/>
+              <w:rPr>
+                <w:color w:val="000000"/>
+                <w:sz w:val="16"/>
+                <w:szCs w:val="16"/>
+              </w:rPr>
+            </w:pPr>
+            <w:r>
+              <w:rPr>
+                <w:rFonts w:eastAsia="arial" w:ascii="arial" w:hAnsi="arial"/>
+                <w:color w:val="000000"/>
+                <w:sz w:val="16"/>
+                <w:szCs w:val="16"/>
+              </w:rPr>
+              <w:t>Dimmer</w:t>
+            </w:r>
+          </w:p>
+        </w:tc>
+        <w:tc>
+          <w:tcPr>
+            <w:tcW w:w="1016" w:type="dxa"/>
+            <w:tcBorders>
+              <w:top w:val="single" w:sz="4" w:space="0" w:color="000000"/>
+              <w:left w:val="single" w:sz="4" w:space="0" w:color="000000"/>
+              <w:bottom w:val="single" w:sz="4" w:space="0" w:color="000000"/>
+            </w:tcBorders>
+            <w:vAlign w:val="bottom"/>
+          </w:tcPr>
+          <w:p>
+            <w:pPr>
+              <w:pStyle w:val="Normal"/>
+              <w:widowControl w:val="false"/>
+              <w:spacing w:lineRule="auto" w:line="180"/>
+              <w:jc w:val="center"/>
+              <w:rPr>
+                <w:color w:val="000000"/>
+                <w:sz w:val="16"/>
+                <w:szCs w:val="16"/>
+              </w:rPr>
+            </w:pPr>
+            <w:r>
+              <w:rPr>
+                <w:rFonts w:eastAsia="arial" w:ascii="arial" w:hAnsi="arial"/>
+                <w:color w:val="000000"/>
+                <w:sz w:val="16"/>
+                <w:szCs w:val="16"/>
+              </w:rPr>
+              <w:t>Gauge Light</w:t>
+            </w:r>
+          </w:p>
+        </w:tc>
+        <w:tc>
+          <w:tcPr>
+            <w:tcW w:w="1016" w:type="dxa"/>
+            <w:tcBorders>
+              <w:top w:val="single" w:sz="4" w:space="0" w:color="000000"/>
+              <w:left w:val="single" w:sz="4" w:space="0" w:color="000000"/>
+              <w:bottom w:val="single" w:sz="4" w:space="0" w:color="000000"/>
+            </w:tcBorders>
+            <w:vAlign w:val="bottom"/>
+          </w:tcPr>
+          <w:p>
+            <w:pPr>
+              <w:pStyle w:val="Normal"/>
+              <w:widowControl w:val="false"/>
+              <w:spacing w:lineRule="auto" w:line="180"/>
+              <w:jc w:val="center"/>
+              <w:rPr>
+                <w:color w:val="000000"/>
+                <w:sz w:val="16"/>
+                <w:szCs w:val="16"/>
+              </w:rPr>
+            </w:pPr>
+            <w:r>
+              <w:rPr>
+                <w:rFonts w:eastAsia="arial" w:ascii="arial" w:hAnsi="arial"/>
+                <w:color w:val="000000"/>
+                <w:sz w:val="16"/>
+                <w:szCs w:val="16"/>
+              </w:rPr>
+              <w:t>Cab Light</w:t>
+            </w:r>
+          </w:p>
+        </w:tc>
+        <w:tc>
+          <w:tcPr>
+            <w:tcW w:w="1016" w:type="dxa"/>
+            <w:tcBorders>
+              <w:top w:val="single" w:sz="4" w:space="0" w:color="000000"/>
+              <w:left w:val="single" w:sz="4" w:space="0" w:color="000000"/>
+              <w:bottom w:val="single" w:sz="4" w:space="0" w:color="000000"/>
+            </w:tcBorders>
+            <w:vAlign w:val="bottom"/>
+          </w:tcPr>
+          <w:p>
+            <w:pPr>
+              <w:pStyle w:val="Normal"/>
+              <w:widowControl w:val="false"/>
+              <w:spacing w:lineRule="auto" w:line="180"/>
+              <w:jc w:val="center"/>
+              <w:rPr>
+                <w:color w:val="000000"/>
+                <w:sz w:val="16"/>
+                <w:szCs w:val="16"/>
+              </w:rPr>
+            </w:pPr>
+            <w:r>
+              <w:rPr>
+                <w:rFonts w:eastAsia="arial" w:ascii="arial" w:hAnsi="arial"/>
+                <w:color w:val="000000"/>
+                <w:sz w:val="16"/>
+                <w:szCs w:val="16"/>
+              </w:rPr>
+              <w:t>1P Cam</w:t>
+            </w:r>
+          </w:p>
+        </w:tc>
+        <w:tc>
+          <w:tcPr>
+            <w:tcW w:w="1029" w:type="dxa"/>
+            <w:tcBorders>
+              <w:top w:val="single" w:sz="4" w:space="0" w:color="000000"/>
+              <w:left w:val="single" w:sz="4" w:space="0" w:color="000000"/>
+              <w:bottom w:val="single" w:sz="4" w:space="0" w:color="000000"/>
+              <w:right w:val="single" w:sz="4" w:space="0" w:color="000000"/>
+            </w:tcBorders>
+            <w:vAlign w:val="bottom"/>
+          </w:tcPr>
+          <w:p>
+            <w:pPr>
+              <w:pStyle w:val="Normal"/>
+              <w:widowControl w:val="false"/>
+              <w:spacing w:lineRule="auto" w:line="180"/>
+              <w:jc w:val="center"/>
+              <w:rPr>
+                <w:color w:val="000000"/>
+                <w:sz w:val="16"/>
+                <w:szCs w:val="16"/>
+              </w:rPr>
+            </w:pPr>
+            <w:r>
+              <w:rPr>
+                <w:rFonts w:eastAsia="arial" w:ascii="arial" w:hAnsi="arial"/>
+                <w:color w:val="000000"/>
+                <w:sz w:val="16"/>
+                <w:szCs w:val="16"/>
+              </w:rPr>
+              <w:t>Next</w:t>
+            </w:r>
+          </w:p>
+          <w:p>
+            <w:pPr>
+              <w:pStyle w:val="Normal"/>
+              <w:widowControl w:val="false"/>
+              <w:spacing w:lineRule="auto" w:line="180"/>
+              <w:jc w:val="center"/>
+              <w:rPr>
+                <w:color w:val="000000"/>
+                <w:sz w:val="16"/>
+                <w:szCs w:val="16"/>
+              </w:rPr>
+            </w:pPr>
+            <w:r>
+              <w:rPr>
+                <w:rFonts w:eastAsia="arial" w:ascii="arial" w:hAnsi="arial"/>
+                <w:color w:val="000000"/>
+                <w:sz w:val="16"/>
+                <w:szCs w:val="16"/>
+              </w:rPr>
+              <w:t>Cab Cam</w:t>
+            </w:r>
+          </w:p>
+        </w:tc>
+      </w:tr>
+    </w:tbl>
+    <w:p>
+      <w:pPr>
+        <w:pStyle w:val="Normal"/>
+        <w:rPr>
+          <w:rFonts w:ascii="arial" w:hAnsi="arial" w:eastAsia="arial"/>
+          <w:color w:val="000000"/>
+          <w:sz w:val="16"/>
+          <w:szCs w:val="16"/>
+        </w:rPr>
+      </w:pPr>
+      <w:r>
+        <w:rPr>
+          <w:rFonts w:eastAsia="arial" w:ascii="arial" w:hAnsi="arial"/>
+          <w:color w:val="000000"/>
+          <w:sz w:val="16"/>
+          <w:szCs w:val="16"/>
+        </w:rPr>
+      </w:r>
+    </w:p>
+    <w:p>
+      <w:pPr>
+        <w:pStyle w:val="Normal"/>
+        <w:rPr>
+          <w:color w:val="000000"/>
+          <w:sz w:val="16"/>
+          <w:szCs w:val="16"/>
+        </w:rPr>
+      </w:pPr>
+      <w:r>
+        <w:rPr>
+          <w:rFonts w:eastAsia="arial" w:ascii="arial" w:hAnsi="arial"/>
+          <w:color w:val="000000"/>
+          <w:sz w:val="16"/>
+          <w:szCs w:val="16"/>
+        </w:rPr>
+        <w:tab/>
+        <w:t xml:space="preserve">           </w:t>
+      </w:r>
+      <w:r>
+        <w:rPr>
+          <w:rFonts w:eastAsia="arial" w:ascii="arial" w:hAnsi="arial"/>
+          <w:color w:val="000000"/>
+          <w:sz w:val="16"/>
+          <w:szCs w:val="16"/>
+        </w:rPr>
+        <w:t>Kiha40-500</w:t>
+      </w:r>
+      <w:r>
+        <w:rPr>
+          <w:rFonts w:eastAsia="arial" w:ascii="arial" w:hAnsi="arial"/>
+          <w:color w:val="000000"/>
+          <w:sz w:val="16"/>
+          <w:szCs w:val="16"/>
+        </w:rPr>
+        <w:t>-2</w:t>
+      </w:r>
+    </w:p>
+    <w:tbl>
+      <w:tblPr>
+        <w:tblW w:w="14248" w:type="dxa"/>
+        <w:jc w:val="left"/>
+        <w:tblInd w:w="-5" w:type="dxa"/>
+        <w:tblLayout w:type="fixed"/>
+        <w:tblCellMar>
+          <w:top w:w="0" w:type="dxa"/>
+          <w:left w:w="108" w:type="dxa"/>
+          <w:bottom w:w="0" w:type="dxa"/>
+          <w:right w:w="108" w:type="dxa"/>
+        </w:tblCellMar>
+        <w:tblLook w:firstRow="1" w:noVBand="1" w:lastRow="0" w:firstColumn="1" w:lastColumn="0" w:noHBand="0" w:val="04a0"/>
+      </w:tblPr>
+      <w:tblGrid>
+        <w:gridCol w:w="1017"/>
+        <w:gridCol w:w="1019"/>
+        <w:gridCol w:w="1014"/>
+        <w:gridCol w:w="1016"/>
+        <w:gridCol w:w="1020"/>
+        <w:gridCol w:w="1016"/>
+        <w:gridCol w:w="1016"/>
+        <w:gridCol w:w="1017"/>
+        <w:gridCol w:w="1016"/>
+        <w:gridCol w:w="1020"/>
+        <w:gridCol w:w="1016"/>
+        <w:gridCol w:w="1016"/>
+        <w:gridCol w:w="1016"/>
+        <w:gridCol w:w="1029"/>
+      </w:tblGrid>
+      <w:tr>
+        <w:trPr>
+          <w:trHeight w:val="440" w:hRule="exact"/>
+          <w:cantSplit w:val="true"/>
+        </w:trPr>
+        <w:tc>
+          <w:tcPr>
+            <w:tcW w:w="1017" w:type="dxa"/>
+            <w:tcBorders>
+              <w:top w:val="single" w:sz="4" w:space="0" w:color="000000"/>
+              <w:left w:val="single" w:sz="4" w:space="0" w:color="000000"/>
+              <w:bottom w:val="single" w:sz="4" w:space="0" w:color="000000"/>
+            </w:tcBorders>
+            <w:vAlign w:val="bottom"/>
+          </w:tcPr>
+          <w:p>
+            <w:pPr>
+              <w:pStyle w:val="Normal"/>
+              <w:widowControl w:val="false"/>
+              <w:spacing w:lineRule="auto" w:line="180" w:before="0" w:after="60"/>
+              <w:jc w:val="center"/>
+              <w:rPr>
+                <w:color w:val="000000"/>
+                <w:sz w:val="16"/>
+                <w:szCs w:val="16"/>
+              </w:rPr>
+            </w:pPr>
+            <w:r>
+              <w:rPr>
+                <w:rFonts w:eastAsia="arial" w:ascii="arial" w:hAnsi="arial"/>
+                <w:b/>
+                <w:color w:val="000000"/>
+                <w:sz w:val="16"/>
+                <w:szCs w:val="16"/>
+              </w:rPr>
+              <w:t>HUD</w:t>
+            </w:r>
+          </w:p>
+        </w:tc>
+        <w:tc>
+          <w:tcPr>
+            <w:tcW w:w="1019" w:type="dxa"/>
+            <w:tcBorders>
+              <w:top w:val="single" w:sz="4" w:space="0" w:color="000000"/>
+              <w:left w:val="single" w:sz="4" w:space="0" w:color="000000"/>
+              <w:bottom w:val="single" w:sz="4" w:space="0" w:color="000000"/>
+            </w:tcBorders>
+            <w:vAlign w:val="bottom"/>
+          </w:tcPr>
+          <w:p>
+            <w:pPr>
+              <w:pStyle w:val="Normal"/>
+              <w:widowControl w:val="false"/>
+              <w:spacing w:lineRule="auto" w:line="180"/>
+              <w:jc w:val="center"/>
+              <w:rPr>
+                <w:rFonts w:ascii="arial" w:hAnsi="arial" w:eastAsia="arial"/>
+                <w:color w:val="000000"/>
+                <w:sz w:val="16"/>
+                <w:szCs w:val="16"/>
+              </w:rPr>
+            </w:pPr>
+            <w:r>
+              <w:rPr>
+                <w:rFonts w:eastAsia="arial" w:ascii="arial" w:hAnsi="arial"/>
+                <w:color w:val="000000"/>
+                <w:sz w:val="16"/>
+                <w:szCs w:val="16"/>
+              </w:rPr>
+              <w:t>Schedule</w:t>
+            </w:r>
+          </w:p>
+        </w:tc>
+        <w:tc>
+          <w:tcPr>
+            <w:tcW w:w="1014" w:type="dxa"/>
+            <w:tcBorders>
+              <w:top w:val="single" w:sz="4" w:space="0" w:color="000000"/>
+              <w:left w:val="single" w:sz="4" w:space="0" w:color="000000"/>
+              <w:bottom w:val="single" w:sz="4" w:space="0" w:color="000000"/>
+            </w:tcBorders>
+            <w:vAlign w:val="bottom"/>
+          </w:tcPr>
+          <w:p>
+            <w:pPr>
+              <w:pStyle w:val="Normal"/>
+              <w:widowControl w:val="false"/>
+              <w:spacing w:lineRule="auto" w:line="180"/>
+              <w:jc w:val="center"/>
+              <w:rPr>
+                <w:sz w:val="16"/>
+                <w:szCs w:val="16"/>
+              </w:rPr>
+            </w:pPr>
+            <w:r>
+              <w:rPr>
+                <w:rFonts w:eastAsia="arial" w:ascii="arial" w:hAnsi="arial"/>
+                <w:sz w:val="16"/>
+                <w:szCs w:val="16"/>
+              </w:rPr>
+              <w:t>Eng. Handle Off</w:t>
+            </w:r>
+          </w:p>
+        </w:tc>
+        <w:tc>
+          <w:tcPr>
+            <w:tcW w:w="1016" w:type="dxa"/>
+            <w:tcBorders>
+              <w:top w:val="single" w:sz="4" w:space="0" w:color="000000"/>
+              <w:left w:val="single" w:sz="4" w:space="0" w:color="000000"/>
+              <w:bottom w:val="single" w:sz="4" w:space="0" w:color="000000"/>
+            </w:tcBorders>
+            <w:vAlign w:val="bottom"/>
+          </w:tcPr>
+          <w:p>
+            <w:pPr>
+              <w:pStyle w:val="Normal"/>
+              <w:widowControl w:val="false"/>
+              <w:spacing w:lineRule="auto" w:line="180"/>
+              <w:jc w:val="center"/>
+              <w:rPr>
+                <w:sz w:val="16"/>
+                <w:szCs w:val="16"/>
+              </w:rPr>
+            </w:pPr>
+            <w:r>
+              <w:rPr>
+                <w:sz w:val="16"/>
+                <w:szCs w:val="16"/>
+              </w:rPr>
+              <w:t>ATS Pow. Off Warn.</w:t>
+            </w:r>
+          </w:p>
+        </w:tc>
+        <w:tc>
+          <w:tcPr>
+            <w:tcW w:w="1020" w:type="dxa"/>
+            <w:tcBorders>
+              <w:top w:val="single" w:sz="4" w:space="0" w:color="000000"/>
+              <w:left w:val="single" w:sz="4" w:space="0" w:color="000000"/>
+              <w:bottom w:val="single" w:sz="4" w:space="0" w:color="000000"/>
+            </w:tcBorders>
+            <w:vAlign w:val="bottom"/>
+          </w:tcPr>
+          <w:p>
+            <w:pPr>
+              <w:pStyle w:val="Normal"/>
+              <w:widowControl w:val="false"/>
+              <w:jc w:val="center"/>
+              <w:rPr>
+                <w:rFonts w:ascii="arial" w:hAnsi="arial" w:eastAsia="arial"/>
+                <w:color w:val="000000"/>
+                <w:sz w:val="16"/>
+                <w:szCs w:val="16"/>
+              </w:rPr>
+            </w:pPr>
+            <w:r>
+              <w:rPr>
+                <w:rFonts w:eastAsia="arial" w:ascii="arial" w:hAnsi="arial"/>
+                <w:color w:val="000000"/>
+                <w:sz w:val="16"/>
+                <w:szCs w:val="16"/>
+              </w:rPr>
+              <w:t>Brake Handle</w:t>
+            </w:r>
+          </w:p>
+        </w:tc>
+        <w:tc>
+          <w:tcPr>
+            <w:tcW w:w="1016" w:type="dxa"/>
+            <w:tcBorders>
+              <w:top w:val="single" w:sz="4" w:space="0" w:color="000000"/>
+              <w:left w:val="single" w:sz="4" w:space="0" w:color="000000"/>
+              <w:bottom w:val="single" w:sz="4" w:space="0" w:color="000000"/>
+            </w:tcBorders>
+            <w:vAlign w:val="bottom"/>
+          </w:tcPr>
+          <w:p>
+            <w:pPr>
+              <w:pStyle w:val="Normal"/>
+              <w:widowControl w:val="false"/>
+              <w:jc w:val="center"/>
+              <w:rPr>
+                <w:color w:val="000000"/>
+                <w:sz w:val="16"/>
+                <w:szCs w:val="16"/>
+              </w:rPr>
+            </w:pPr>
+            <w:r>
+              <w:rPr>
+                <w:color w:val="000000"/>
+                <w:sz w:val="16"/>
+                <w:szCs w:val="16"/>
+              </w:rPr>
+              <w:t>Trans. Hydraulic</w:t>
+            </w:r>
+          </w:p>
+        </w:tc>
+        <w:tc>
+          <w:tcPr>
+            <w:tcW w:w="1016" w:type="dxa"/>
+            <w:tcBorders>
+              <w:top w:val="single" w:sz="4" w:space="0" w:color="000000"/>
+              <w:left w:val="single" w:sz="4" w:space="0" w:color="000000"/>
+              <w:bottom w:val="single" w:sz="4" w:space="0" w:color="000000"/>
+            </w:tcBorders>
+            <w:vAlign w:val="bottom"/>
+          </w:tcPr>
+          <w:p>
+            <w:pPr>
+              <w:pStyle w:val="Normal"/>
+              <w:widowControl w:val="false"/>
+              <w:jc w:val="center"/>
+              <w:rPr>
+                <w:color w:val="000000"/>
+                <w:sz w:val="16"/>
+                <w:szCs w:val="16"/>
+              </w:rPr>
+            </w:pPr>
+            <w:r>
+              <w:rPr>
+                <w:color w:val="000000"/>
+                <w:sz w:val="16"/>
+                <w:szCs w:val="16"/>
+              </w:rPr>
+              <w:t>Cab Handle</w:t>
+            </w:r>
+          </w:p>
+        </w:tc>
+        <w:tc>
+          <w:tcPr>
+            <w:tcW w:w="1017" w:type="dxa"/>
+            <w:tcBorders>
+              <w:top w:val="single" w:sz="4" w:space="0" w:color="000000"/>
+              <w:left w:val="single" w:sz="4" w:space="0" w:color="000000"/>
+              <w:bottom w:val="single" w:sz="4" w:space="0" w:color="000000"/>
+            </w:tcBorders>
+            <w:vAlign w:val="bottom"/>
+          </w:tcPr>
+          <w:p>
+            <w:pPr>
+              <w:pStyle w:val="Normal"/>
+              <w:widowControl w:val="false"/>
+              <w:jc w:val="center"/>
+              <w:rPr>
+                <w:color w:val="000000"/>
+                <w:sz w:val="16"/>
+                <w:szCs w:val="16"/>
+              </w:rPr>
+            </w:pPr>
+            <w:r>
+              <w:rPr>
+                <w:rFonts w:eastAsia="arial" w:ascii="arial" w:hAnsi="arial"/>
+                <w:color w:val="000000"/>
+                <w:sz w:val="16"/>
+                <w:szCs w:val="16"/>
+              </w:rPr>
+              <w:t>Cab Deactivate</w:t>
+            </w:r>
+          </w:p>
+        </w:tc>
+        <w:tc>
+          <w:tcPr>
+            <w:tcW w:w="1016" w:type="dxa"/>
+            <w:tcBorders>
+              <w:top w:val="single" w:sz="4" w:space="0" w:color="000000"/>
+              <w:left w:val="single" w:sz="4" w:space="0" w:color="000000"/>
+              <w:bottom w:val="single" w:sz="4" w:space="0" w:color="000000"/>
+            </w:tcBorders>
+            <w:vAlign w:val="bottom"/>
+          </w:tcPr>
+          <w:p>
+            <w:pPr>
+              <w:pStyle w:val="Normal"/>
+              <w:widowControl w:val="false"/>
+              <w:bidi w:val="0"/>
+              <w:spacing w:lineRule="auto" w:line="180"/>
+              <w:jc w:val="center"/>
+              <w:rPr>
+                <w:color w:val="000000"/>
+                <w:sz w:val="16"/>
+                <w:szCs w:val="16"/>
+              </w:rPr>
+            </w:pPr>
+            <w:r>
+              <w:rPr>
+                <w:rFonts w:eastAsia="arial" w:ascii="arial" w:hAnsi="arial"/>
+                <w:color w:val="000000"/>
+                <w:sz w:val="16"/>
+                <w:szCs w:val="16"/>
+              </w:rPr>
+              <w:t>Dest. Board Dw</w:t>
+            </w:r>
+          </w:p>
+        </w:tc>
+        <w:tc>
+          <w:tcPr>
+            <w:tcW w:w="1020" w:type="dxa"/>
+            <w:tcBorders>
+              <w:top w:val="single" w:sz="4" w:space="0" w:color="000000"/>
+              <w:left w:val="single" w:sz="4" w:space="0" w:color="000000"/>
+              <w:bottom w:val="single" w:sz="4" w:space="0" w:color="000000"/>
+            </w:tcBorders>
+            <w:vAlign w:val="bottom"/>
+          </w:tcPr>
+          <w:p>
+            <w:pPr>
+              <w:pStyle w:val="Normal"/>
+              <w:widowControl w:val="false"/>
+              <w:jc w:val="center"/>
+              <w:rPr>
+                <w:color w:val="000000"/>
+                <w:sz w:val="16"/>
+                <w:szCs w:val="16"/>
+              </w:rPr>
+            </w:pPr>
+            <w:r>
+              <w:rPr>
+                <w:rFonts w:eastAsia="arial" w:ascii="arial" w:hAnsi="arial"/>
+                <w:color w:val="000000"/>
+                <w:sz w:val="16"/>
+                <w:szCs w:val="16"/>
+              </w:rPr>
+              <w:t>Dest.  Light</w:t>
+            </w:r>
+          </w:p>
+        </w:tc>
+        <w:tc>
+          <w:tcPr>
+            <w:tcW w:w="1016" w:type="dxa"/>
+            <w:tcBorders>
+              <w:top w:val="single" w:sz="4" w:space="0" w:color="000000"/>
+              <w:left w:val="single" w:sz="4" w:space="0" w:color="000000"/>
+              <w:bottom w:val="single" w:sz="4" w:space="0" w:color="000000"/>
+            </w:tcBorders>
+            <w:vAlign w:val="bottom"/>
+          </w:tcPr>
+          <w:p>
+            <w:pPr>
+              <w:pStyle w:val="Normal"/>
+              <w:widowControl w:val="false"/>
+              <w:jc w:val="center"/>
+              <w:rPr>
+                <w:color w:val="000000"/>
+                <w:sz w:val="16"/>
+                <w:szCs w:val="16"/>
+              </w:rPr>
+            </w:pPr>
+            <w:r>
+              <w:rPr>
+                <w:rFonts w:eastAsia="arial" w:ascii="arial" w:hAnsi="arial"/>
+                <w:color w:val="000000"/>
+                <w:sz w:val="16"/>
+                <w:szCs w:val="16"/>
+              </w:rPr>
+              <w:t>Marker Light</w:t>
+            </w:r>
+          </w:p>
+        </w:tc>
+        <w:tc>
+          <w:tcPr>
+            <w:tcW w:w="1016" w:type="dxa"/>
+            <w:tcBorders>
+              <w:top w:val="single" w:sz="4" w:space="0" w:color="000000"/>
+              <w:left w:val="single" w:sz="4" w:space="0" w:color="000000"/>
+              <w:bottom w:val="single" w:sz="4" w:space="0" w:color="000000"/>
+            </w:tcBorders>
+            <w:vAlign w:val="bottom"/>
+          </w:tcPr>
+          <w:p>
+            <w:pPr>
+              <w:pStyle w:val="Normal"/>
+              <w:widowControl w:val="false"/>
+              <w:spacing w:lineRule="auto" w:line="180"/>
+              <w:jc w:val="center"/>
+              <w:rPr>
+                <w:sz w:val="16"/>
+                <w:szCs w:val="16"/>
+              </w:rPr>
+            </w:pPr>
+            <w:r>
+              <w:rPr>
+                <w:rFonts w:eastAsia="arial" w:ascii="arial" w:hAnsi="arial"/>
+                <w:sz w:val="16"/>
+                <w:szCs w:val="16"/>
+              </w:rPr>
+              <w:t>Cabin Light</w:t>
             </w:r>
           </w:p>
         </w:tc>
@@ -14334,12 +15530,12 @@
       <w:rFonts w:ascii="Symbol" w:hAnsi="Symbol" w:cs="Symbol"/>
     </w:rPr>
   </w:style>
-  <w:style w:type="character" w:styleId="Style5" w:customStyle="1">
-    <w:name w:val="번호 매기기 기호"/>
+  <w:style w:type="character" w:styleId="user" w:customStyle="1">
+    <w:name w:val="번호 매기기 기호 (user)"/>
     <w:qFormat/>
     <w:rPr/>
   </w:style>
-  <w:style w:type="paragraph" w:styleId="Style6">
+  <w:style w:type="paragraph" w:styleId="Style5">
     <w:name w:val="제목"/>
     <w:basedOn w:val="Normal"/>
     <w:next w:val="BodyText"/>
@@ -14349,7 +15545,7 @@
       <w:spacing w:before="240" w:after="120"/>
     </w:pPr>
     <w:rPr>
-      <w:rFonts w:ascii="Liberation Sans" w:hAnsi="Liberation Sans" w:eastAsia="나눔고딕" w:cs="Arial"/>
+      <w:rFonts w:ascii="Liberation Sans" w:hAnsi="Liberation Sans" w:eastAsia="Noto Sans CJK KR" w:cs="Lohit Devanagari"/>
       <w:sz w:val="28"/>
       <w:szCs w:val="28"/>
     </w:rPr>
@@ -14386,7 +15582,7 @@
       <w:szCs w:val="24"/>
     </w:rPr>
   </w:style>
-  <w:style w:type="paragraph" w:styleId="Style7">
+  <w:style w:type="paragraph" w:styleId="Style6" w:customStyle="1">
     <w:name w:val="색인"/>
     <w:basedOn w:val="Normal"/>
     <w:qFormat/>
@@ -14394,11 +15590,10 @@
       <w:suppressLineNumbers/>
     </w:pPr>
     <w:rPr>
-      <w:rFonts w:cs="Arial"/>
-      <w:sz w:val="24"/>
+      <w:rFonts w:cs="Lohit Devanagari"/>
     </w:rPr>
   </w:style>
-  <w:style w:type="paragraph" w:styleId="user">
+  <w:style w:type="paragraph" w:styleId="user1">
     <w:name w:val="제목 (user)"/>
     <w:basedOn w:val="Normal"/>
     <w:next w:val="BodyText"/>
@@ -14408,12 +15603,12 @@
       <w:spacing w:before="240" w:after="120"/>
     </w:pPr>
     <w:rPr>
-      <w:rFonts w:ascii="Liberation Sans" w:hAnsi="Liberation Sans" w:eastAsia="Noto Sans CJK KR" w:cs="Lohit Devanagari"/>
+      <w:rFonts w:ascii="Liberation Sans" w:hAnsi="Liberation Sans" w:eastAsia="나눔고딕" w:cs="Arial"/>
       <w:sz w:val="28"/>
       <w:szCs w:val="28"/>
     </w:rPr>
   </w:style>
-  <w:style w:type="paragraph" w:styleId="user1" w:customStyle="1">
+  <w:style w:type="paragraph" w:styleId="user2">
     <w:name w:val="색인 (user)"/>
     <w:basedOn w:val="Normal"/>
     <w:qFormat/>
@@ -14421,7 +15616,8 @@
       <w:suppressLineNumbers/>
     </w:pPr>
     <w:rPr>
-      <w:rFonts w:cs="Lohit Devanagari"/>
+      <w:rFonts w:cs="Arial"/>
+      <w:sz w:val="24"/>
     </w:rPr>
   </w:style>
   <w:style w:type="paragraph" w:styleId="Title">
@@ -15103,8 +16299,8 @@
       <w:szCs w:val="24"/>
     </w:rPr>
   </w:style>
-  <w:style w:type="paragraph" w:styleId="user2" w:customStyle="1">
-    <w:name w:val="표 내용 (user)"/>
+  <w:style w:type="paragraph" w:styleId="Style7" w:customStyle="1">
+    <w:name w:val="표 내용"/>
     <w:basedOn w:val="Normal"/>
     <w:qFormat/>
     <w:pPr>
@@ -15112,9 +16308,9 @@
     </w:pPr>
     <w:rPr/>
   </w:style>
-  <w:style w:type="paragraph" w:styleId="user3" w:customStyle="1">
-    <w:name w:val="표제목 (user)"/>
-    <w:basedOn w:val="user2"/>
+  <w:style w:type="paragraph" w:styleId="Style8" w:customStyle="1">
+    <w:name w:val="표제목"/>
+    <w:basedOn w:val="Style7"/>
     <w:qFormat/>
     <w:pPr>
       <w:jc w:val="center"/>
@@ -15124,8 +16320,8 @@
       <w:bCs/>
     </w:rPr>
   </w:style>
-  <w:style w:type="paragraph" w:styleId="Style8">
-    <w:name w:val="표 내용"/>
+  <w:style w:type="paragraph" w:styleId="user3">
+    <w:name w:val="표 내용 (user)"/>
     <w:basedOn w:val="Normal"/>
     <w:qFormat/>
     <w:pPr>
@@ -15134,9 +16330,9 @@
     </w:pPr>
     <w:rPr/>
   </w:style>
-  <w:style w:type="paragraph" w:styleId="Style9">
-    <w:name w:val="표제목"/>
-    <w:basedOn w:val="Style8"/>
+  <w:style w:type="paragraph" w:styleId="user4">
+    <w:name w:val="표제목 (user)"/>
+    <w:basedOn w:val="user3"/>
     <w:qFormat/>
     <w:pPr>
       <w:suppressLineNumbers/>

</xml_diff>